<commit_message>
Add proposal wording review skill
</commit_message>
<xml_diff>
--- a/applications/2026/Q2/BGA200内存返修工具/BGA200内存返修工具-申报书.docx
+++ b/applications/2026/Q2/BGA200内存返修工具/BGA200内存返修工具-申报书.docx
@@ -277,7 +277,13 @@
               <w:rPr>
                 <w:rFonts w:ascii="Times New Roman" w:hAnsi="Times New Roman" w:eastAsia="宋体"/>
               </w:rPr>
-              <w:t>当前记录价</w:t>
+            </w:r>
+            <w:r>
+              <w:rPr>
+                <w:rFonts w:ascii="Times New Roman" w:hAnsi="Times New Roman" w:eastAsia="宋体"/>
+                <w:sz w:val="24"/>
+              </w:rPr>
+              <w:t>申报金额</w:t>
             </w:r>
           </w:p>
         </w:tc>
@@ -355,7 +361,13 @@
               <w:rPr>
                 <w:rFonts w:ascii="Times New Roman" w:hAnsi="Times New Roman" w:eastAsia="宋体"/>
               </w:rPr>
-              <w:t>实际以审批后订单及发票为准</w:t>
+            </w:r>
+            <w:r>
+              <w:rPr>
+                <w:rFonts w:ascii="Times New Roman" w:hAnsi="Times New Roman" w:eastAsia="宋体"/>
+                <w:sz w:val="24"/>
+              </w:rPr>
+              <w:t>预算合计</w:t>
             </w:r>
           </w:p>
         </w:tc>
@@ -423,7 +435,13 @@
         <w:rPr>
           <w:rFonts w:ascii="Times New Roman" w:hAnsi="Times New Roman" w:eastAsia="宋体"/>
         </w:rPr>
-        <w:t>本次经费按当前记录价格测算，实际采购金额以审批后订单及发票为准。</w:t>
+      </w:r>
+      <w:r>
+        <w:rPr>
+          <w:rFonts w:ascii="Times New Roman" w:hAnsi="Times New Roman" w:eastAsia="宋体"/>
+          <w:sz w:val="24"/>
+        </w:rPr>
+        <w:t>本项目采购对象明确，预算用于购置申报表中列明的工具与耗材，采购后按实验室设备耗材管理要求入库和使用。</w:t>
       </w:r>
     </w:p>
     <w:p>

</xml_diff>

<commit_message>
Tighten proposal wording review
</commit_message>
<xml_diff>
--- a/applications/2026/Q2/BGA200内存返修工具/BGA200内存返修工具-申报书.docx
+++ b/applications/2026/Q2/BGA200内存返修工具/BGA200内存返修工具-申报书.docx
@@ -4,6 +4,7 @@
   <w:body>
     <w:p>
       <w:pPr>
+        <w:spacing w:after="280"/>
         <w:jc w:val="center"/>
       </w:pPr>
       <w:r>
@@ -17,51 +18,124 @@
     </w:p>
     <w:p>
       <w:pPr>
+        <w:jc w:val="center"/>
+      </w:pPr>
+      <w:r>
+        <w:rPr>
+          <w:rFonts w:ascii="Times New Roman" w:hAnsi="Times New Roman" w:eastAsia="宋体"/>
+          <w:b w:val="0"/>
+          <w:sz w:val="22"/>
+        </w:rPr>
+        <w:t>申报日期：2026-05-25    申报状态：待提交</w:t>
+      </w:r>
+    </w:p>
+    <w:p>
+      <w:pPr>
         <w:pStyle w:val="Heading1"/>
+        <w:spacing w:before="200" w:after="120"/>
       </w:pPr>
       <w:r>
         <w:rPr>
           <w:rFonts w:ascii="Times New Roman" w:hAnsi="Times New Roman" w:eastAsia="黑体"/>
+          <w:b/>
           <w:sz w:val="28"/>
         </w:rPr>
         <w:t>一、需求分析</w:t>
       </w:r>
     </w:p>
     <w:p>
+      <w:pPr>
+        <w:spacing w:line="324" w:lineRule="auto" w:after="120"/>
+        <w:ind w:firstLine="420"/>
+      </w:pPr>
       <w:r>
         <w:rPr>
           <w:rFonts w:ascii="Times New Roman" w:hAnsi="Times New Roman" w:eastAsia="宋体"/>
+          <w:b w:val="0"/>
+          <w:sz w:val="24"/>
         </w:rPr>
-        <w:t>开发板、FPGA 板卡和边缘计算板常使用 BGA/LPDDR 类内存颗粒，维修和升级时如果完全依赖整板替换，成本高且周期不可控。实验室需要低成本、可长期复用的 BGA200 植锡工具，用于建立内存颗粒拆焊、植锡、回流和检查的返修工具条件。</w:t>
+        <w:t>实验室现有 FPGA 板卡、Linux 开发板和边缘计算板在长期调试、反复焊接和样机验证过程中，可能出现 BGA200 封装内存颗粒虚焊、焊点异常、拆装返修和焊后检查需求。此类问题如果完全依赖整板替换或外部维修，不仅成本高、周期长，也会影响样机联调和实验进度。购置 BGA200 4 合 1 植锡台，能够为实验室补齐小型 BGA 封装返修的基础工具条件。</w:t>
+      </w:r>
+    </w:p>
+    <w:p>
+      <w:pPr>
+        <w:spacing w:line="324" w:lineRule="auto" w:after="120"/>
+        <w:ind w:firstLine="420"/>
+      </w:pPr>
+      <w:r>
+        <w:rPr>
+          <w:rFonts w:ascii="Times New Roman" w:hAnsi="Times New Roman" w:eastAsia="宋体"/>
+          <w:b w:val="0"/>
+          <w:sz w:val="24"/>
+        </w:rPr>
+        <w:t>BGA200 封装焊点密集、对位窗口小，返修过程对定位、锡量、钢网贴合和回流一致性要求较高。普通通用钢网或临时夹具难以保证重复操作质量，容易出现锡量不均、少锡、连锡和偏位等问题。专用植锡台可以提供稳定的底座、钢网、磁吸定位和刮锡条件，使返修流程从临时手工操作转变为可记录、可复用的实验室工艺流程。</w:t>
+      </w:r>
+    </w:p>
+    <w:p>
+      <w:pPr>
+        <w:spacing w:line="324" w:lineRule="auto" w:after="120"/>
+        <w:ind w:firstLine="420"/>
+      </w:pPr>
+      <w:r>
+        <w:rPr>
+          <w:rFonts w:ascii="Times New Roman" w:hAnsi="Times New Roman" w:eastAsia="宋体"/>
+          <w:b w:val="0"/>
+          <w:sz w:val="24"/>
+        </w:rPr>
+        <w:t>本项目采购对象仅为返修工具，不包含内存颗粒等耗材采购。申报重点是建立实验室的 BGA200 封装返修工具能力，用于支撑后续硬件维护、故障定位、焊接工艺验证和板卡维修，而不是采购具体 DDR4 或其他内存颗粒。</w:t>
       </w:r>
     </w:p>
     <w:p>
       <w:pPr>
         <w:pStyle w:val="Heading1"/>
+        <w:spacing w:before="200" w:after="120"/>
       </w:pPr>
       <w:r>
         <w:rPr>
           <w:rFonts w:ascii="Times New Roman" w:hAnsi="Times New Roman" w:eastAsia="黑体"/>
+          <w:b/>
           <w:sz w:val="28"/>
         </w:rPr>
         <w:t>二、目的用途</w:t>
       </w:r>
     </w:p>
     <w:p>
+      <w:pPr>
+        <w:spacing w:line="324" w:lineRule="auto" w:after="120"/>
+        <w:ind w:firstLine="420"/>
+      </w:pPr>
       <w:r>
         <w:rPr>
           <w:rFonts w:ascii="Times New Roman" w:hAnsi="Times New Roman" w:eastAsia="宋体"/>
+          <w:b w:val="0"/>
+          <w:sz w:val="24"/>
         </w:rPr>
-        <w:t>采购 BGA200 4 合 1 植锡台，用于建立 BGA200 内存颗粒返修工具条件。工具用于钢网定位、上锡和重复返修验证，配套 LPDDR4X 颗粒已归入实验室电子元器件申报，工具与耗材分开归档。</w:t>
+        <w:t>本项目用于购置 BGA200 4 合 1 植锡台，建立内存颗粒拆焊、清焊盘、定位、上锡、回流和焊后检查的基础工具条件。该工具可用于 FPGA、Linux 开发板、边缘计算板等实验平台的 BGA200 封装存储器件返修场景，帮助实验室在硬件调试过程中快速判断焊接和封装相关问题。</w:t>
+      </w:r>
+    </w:p>
+    <w:p>
+      <w:pPr>
+        <w:spacing w:line="324" w:lineRule="auto" w:after="120"/>
+        <w:ind w:firstLine="420"/>
+      </w:pPr>
+      <w:r>
+        <w:rPr>
+          <w:rFonts w:ascii="Times New Roman" w:hAnsi="Times New Roman" w:eastAsia="宋体"/>
+          <w:b w:val="0"/>
+          <w:sz w:val="24"/>
+        </w:rPr>
+        <w:t>该工具的作用不是单次耗材消耗，而是形成长期复用的实验室基础工艺能力。通过固定工具、固定流程和固定记录方式，可以积累焊盘处理、锡膏量控制、定位误差、回流温度和焊后检查经验，为后续板卡维修、样机调试和硬件可靠性改进提供支撑。</w:t>
       </w:r>
     </w:p>
     <w:p>
       <w:pPr>
         <w:pStyle w:val="Heading1"/>
+        <w:spacing w:before="200" w:after="120"/>
       </w:pPr>
       <w:r>
         <w:rPr>
           <w:rFonts w:ascii="Times New Roman" w:hAnsi="Times New Roman" w:eastAsia="黑体"/>
+          <w:b/>
           <w:sz w:val="28"/>
         </w:rPr>
         <w:t>三、实现目标</w:t>
@@ -70,43 +144,82 @@
     <w:p>
       <w:pPr>
         <w:pStyle w:val="ListBullet"/>
+        <w:spacing w:line="312" w:lineRule="auto" w:after="80"/>
       </w:pPr>
       <w:r>
         <w:rPr>
           <w:rFonts w:ascii="Times New Roman" w:hAnsi="Times New Roman" w:eastAsia="宋体"/>
+          <w:b w:val="0"/>
+          <w:sz w:val="24"/>
         </w:rPr>
-        <w:t>拥有一套可长期复用的 BGA200 内存颗粒返修工具，包含钢网、定位板、磁铁底座和刮刀等核心部件。</w:t>
+        <w:t>拥有一套 BGA200 内存颗粒植锡与返修工具，满足实验室小型 BGA 封装返修的基础操作需求。</w:t>
       </w:r>
     </w:p>
     <w:p>
       <w:pPr>
         <w:pStyle w:val="ListBullet"/>
+        <w:spacing w:line="312" w:lineRule="auto" w:after="80"/>
       </w:pPr>
       <w:r>
         <w:rPr>
           <w:rFonts w:ascii="Times New Roman" w:hAnsi="Times New Roman" w:eastAsia="宋体"/>
+          <w:b w:val="0"/>
+          <w:sz w:val="24"/>
         </w:rPr>
-        <w:t>完成 Radxa Cubie A5E 相关内存升级准备，将 1G 版本升级为 4G 内存作为后续板级验证目标。</w:t>
+        <w:t>形成 BGA200 封装返修流程记录，覆盖工具准备、焊盘处理、定位、上锡、回流和焊后检查。</w:t>
       </w:r>
     </w:p>
     <w:p>
       <w:pPr>
         <w:pStyle w:val="ListBullet"/>
+        <w:spacing w:line="312" w:lineRule="auto" w:after="80"/>
       </w:pPr>
       <w:r>
         <w:rPr>
           <w:rFonts w:ascii="Times New Roman" w:hAnsi="Times New Roman" w:eastAsia="宋体"/>
+          <w:b w:val="0"/>
+          <w:sz w:val="24"/>
         </w:rPr>
-        <w:t>形成 BGA200 内存颗粒拆焊、植锡、回流和检查流程记录，用于 FPGA、Linux 开发板、A5E 等平台的内存颗粒返修。</w:t>
+        <w:t>完成一次废板或测试颗粒的流程验证，记录锡量、对位、回流和焊点检查结果。</w:t>
+      </w:r>
+    </w:p>
+    <w:p>
+      <w:pPr>
+        <w:pStyle w:val="ListBullet"/>
+        <w:spacing w:line="312" w:lineRule="auto" w:after="80"/>
+      </w:pPr>
+      <w:r>
+        <w:rPr>
+          <w:rFonts w:ascii="Times New Roman" w:hAnsi="Times New Roman" w:eastAsia="宋体"/>
+          <w:b w:val="0"/>
+          <w:sz w:val="24"/>
+        </w:rPr>
+        <w:t>建立 FPGA、Linux 开发板和边缘计算板返修场景下的适用边界、风险点和操作注意事项。</w:t>
+      </w:r>
+    </w:p>
+    <w:p>
+      <w:pPr>
+        <w:pStyle w:val="ListBullet"/>
+        <w:spacing w:line="312" w:lineRule="auto" w:after="80"/>
+      </w:pPr>
+      <w:r>
+        <w:rPr>
+          <w:rFonts w:ascii="Times New Roman" w:hAnsi="Times New Roman" w:eastAsia="宋体"/>
+          <w:b w:val="0"/>
+          <w:sz w:val="24"/>
+        </w:rPr>
+        <w:t>形成可复用的实验室硬件维修工具条件，减少板卡返修完全依赖外部维修或整板替换的情况。</w:t>
       </w:r>
     </w:p>
     <w:p>
       <w:pPr>
         <w:pStyle w:val="Heading1"/>
+        <w:spacing w:before="200" w:after="120"/>
       </w:pPr>
       <w:r>
         <w:rPr>
           <w:rFonts w:ascii="Times New Roman" w:hAnsi="Times New Roman" w:eastAsia="黑体"/>
+          <w:b/>
           <w:sz w:val="28"/>
         </w:rPr>
         <w:t>经费数量</w:t>
@@ -116,26 +229,34 @@
       <w:tblPr>
         <w:tblStyle w:val="TableGrid"/>
         <w:tblW w:type="auto" w:w="0"/>
+        <w:jc w:val="center"/>
         <w:tblLook w:firstColumn="1" w:firstRow="1" w:lastColumn="0" w:lastRow="0" w:noHBand="0" w:noVBand="1" w:val="04A0"/>
       </w:tblPr>
       <w:tblGrid>
-        <w:gridCol w:w="1728"/>
-        <w:gridCol w:w="1728"/>
-        <w:gridCol w:w="1728"/>
-        <w:gridCol w:w="1728"/>
-        <w:gridCol w:w="1728"/>
+        <w:gridCol w:w="1836"/>
+        <w:gridCol w:w="1836"/>
+        <w:gridCol w:w="1836"/>
+        <w:gridCol w:w="1836"/>
+        <w:gridCol w:w="1836"/>
       </w:tblGrid>
       <w:tr>
         <w:tc>
           <w:tcPr>
-            <w:tcW w:type="dxa" w:w="1728"/>
+            <w:tcW w:type="dxa" w:w="1836"/>
+            <w:vAlign w:val="center"/>
+            <w:shd w:fill="D9EAF7"/>
           </w:tcPr>
           <w:p>
+            <w:pPr>
+              <w:spacing w:after="0" w:line="288" w:lineRule="auto"/>
+              <w:jc w:val="center"/>
+            </w:pPr>
+            <w:r/>
             <w:r>
               <w:rPr>
-                <w:rFonts w:ascii="Times New Roman" w:hAnsi="Times New Roman" w:eastAsia="黑体"/>
+                <w:rFonts w:ascii="Times New Roman" w:hAnsi="Times New Roman" w:eastAsia="宋体"/>
                 <w:b/>
-                <w:sz w:val="16"/>
+                <w:sz w:val="21"/>
               </w:rPr>
               <w:t>项目</w:t>
             </w:r>
@@ -143,14 +264,21 @@
         </w:tc>
         <w:tc>
           <w:tcPr>
-            <w:tcW w:type="dxa" w:w="1728"/>
+            <w:tcW w:type="dxa" w:w="1836"/>
+            <w:vAlign w:val="center"/>
+            <w:shd w:fill="D9EAF7"/>
           </w:tcPr>
           <w:p>
+            <w:pPr>
+              <w:spacing w:after="0" w:line="288" w:lineRule="auto"/>
+              <w:jc w:val="center"/>
+            </w:pPr>
+            <w:r/>
             <w:r>
               <w:rPr>
-                <w:rFonts w:ascii="Times New Roman" w:hAnsi="Times New Roman" w:eastAsia="黑体"/>
+                <w:rFonts w:ascii="Times New Roman" w:hAnsi="Times New Roman" w:eastAsia="宋体"/>
                 <w:b/>
-                <w:sz w:val="16"/>
+                <w:sz w:val="21"/>
               </w:rPr>
               <w:t>数量</w:t>
             </w:r>
@@ -158,14 +286,21 @@
         </w:tc>
         <w:tc>
           <w:tcPr>
-            <w:tcW w:type="dxa" w:w="1728"/>
+            <w:tcW w:type="dxa" w:w="1836"/>
+            <w:vAlign w:val="center"/>
+            <w:shd w:fill="D9EAF7"/>
           </w:tcPr>
           <w:p>
+            <w:pPr>
+              <w:spacing w:after="0" w:line="288" w:lineRule="auto"/>
+              <w:jc w:val="center"/>
+            </w:pPr>
+            <w:r/>
             <w:r>
               <w:rPr>
-                <w:rFonts w:ascii="Times New Roman" w:hAnsi="Times New Roman" w:eastAsia="黑体"/>
+                <w:rFonts w:ascii="Times New Roman" w:hAnsi="Times New Roman" w:eastAsia="宋体"/>
                 <w:b/>
-                <w:sz w:val="16"/>
+                <w:sz w:val="21"/>
               </w:rPr>
               <w:t>单价(CNY)</w:t>
             </w:r>
@@ -173,14 +308,21 @@
         </w:tc>
         <w:tc>
           <w:tcPr>
-            <w:tcW w:type="dxa" w:w="1728"/>
+            <w:tcW w:type="dxa" w:w="1836"/>
+            <w:vAlign w:val="center"/>
+            <w:shd w:fill="D9EAF7"/>
           </w:tcPr>
           <w:p>
+            <w:pPr>
+              <w:spacing w:after="0" w:line="288" w:lineRule="auto"/>
+              <w:jc w:val="center"/>
+            </w:pPr>
+            <w:r/>
             <w:r>
               <w:rPr>
-                <w:rFonts w:ascii="Times New Roman" w:hAnsi="Times New Roman" w:eastAsia="黑体"/>
+                <w:rFonts w:ascii="Times New Roman" w:hAnsi="Times New Roman" w:eastAsia="宋体"/>
                 <w:b/>
-                <w:sz w:val="16"/>
+                <w:sz w:val="21"/>
               </w:rPr>
               <w:t>小计(CNY)</w:t>
             </w:r>
@@ -188,14 +330,21 @@
         </w:tc>
         <w:tc>
           <w:tcPr>
-            <w:tcW w:type="dxa" w:w="1728"/>
+            <w:tcW w:type="dxa" w:w="1836"/>
+            <w:vAlign w:val="center"/>
+            <w:shd w:fill="D9EAF7"/>
           </w:tcPr>
           <w:p>
+            <w:pPr>
+              <w:spacing w:after="0" w:line="288" w:lineRule="auto"/>
+              <w:jc w:val="center"/>
+            </w:pPr>
+            <w:r/>
             <w:r>
               <w:rPr>
-                <w:rFonts w:ascii="Times New Roman" w:hAnsi="Times New Roman" w:eastAsia="黑体"/>
+                <w:rFonts w:ascii="Times New Roman" w:hAnsi="Times New Roman" w:eastAsia="宋体"/>
                 <w:b/>
-                <w:sz w:val="16"/>
+                <w:sz w:val="20"/>
               </w:rPr>
               <w:t>备注</w:t>
             </w:r>
@@ -205,13 +354,19 @@
       <w:tr>
         <w:tc>
           <w:tcPr>
-            <w:tcW w:type="dxa" w:w="1728"/>
+            <w:tcW w:type="dxa" w:w="1836"/>
+            <w:vAlign w:val="center"/>
           </w:tcPr>
           <w:p>
+            <w:pPr>
+              <w:spacing w:after="0" w:line="288" w:lineRule="auto"/>
+            </w:pPr>
+            <w:r/>
             <w:r>
               <w:rPr>
                 <w:rFonts w:ascii="Times New Roman" w:hAnsi="Times New Roman" w:eastAsia="宋体"/>
-                <w:sz w:val="16"/>
+                <w:b w:val="0"/>
+                <w:sz w:val="21"/>
               </w:rPr>
               <w:t>BGA200 4合1植锡台</w:t>
             </w:r>
@@ -219,16 +374,20 @@
         </w:tc>
         <w:tc>
           <w:tcPr>
-            <w:tcW w:type="dxa" w:w="1728"/>
+            <w:tcW w:type="dxa" w:w="1836"/>
+            <w:vAlign w:val="center"/>
           </w:tcPr>
           <w:p>
             <w:pPr>
+              <w:spacing w:after="0" w:line="288" w:lineRule="auto"/>
               <w:jc w:val="center"/>
             </w:pPr>
+            <w:r/>
             <w:r>
               <w:rPr>
                 <w:rFonts w:ascii="Times New Roman" w:hAnsi="Times New Roman" w:eastAsia="宋体"/>
-                <w:sz w:val="16"/>
+                <w:b w:val="0"/>
+                <w:sz w:val="21"/>
               </w:rPr>
               <w:t>1</w:t>
             </w:r>
@@ -236,16 +395,20 @@
         </w:tc>
         <w:tc>
           <w:tcPr>
-            <w:tcW w:type="dxa" w:w="1728"/>
+            <w:tcW w:type="dxa" w:w="1836"/>
+            <w:vAlign w:val="center"/>
           </w:tcPr>
           <w:p>
             <w:pPr>
+              <w:spacing w:after="0" w:line="288" w:lineRule="auto"/>
               <w:jc w:val="center"/>
             </w:pPr>
+            <w:r/>
             <w:r>
               <w:rPr>
                 <w:rFonts w:ascii="Times New Roman" w:hAnsi="Times New Roman" w:eastAsia="宋体"/>
-                <w:sz w:val="16"/>
+                <w:b w:val="0"/>
+                <w:sz w:val="21"/>
               </w:rPr>
               <w:t>167.00</w:t>
             </w:r>
@@ -253,16 +416,20 @@
         </w:tc>
         <w:tc>
           <w:tcPr>
-            <w:tcW w:type="dxa" w:w="1728"/>
+            <w:tcW w:type="dxa" w:w="1836"/>
+            <w:vAlign w:val="center"/>
           </w:tcPr>
           <w:p>
             <w:pPr>
+              <w:spacing w:after="0" w:line="288" w:lineRule="auto"/>
               <w:jc w:val="center"/>
             </w:pPr>
+            <w:r/>
             <w:r>
               <w:rPr>
                 <w:rFonts w:ascii="Times New Roman" w:hAnsi="Times New Roman" w:eastAsia="宋体"/>
-                <w:sz w:val="16"/>
+                <w:b w:val="0"/>
+                <w:sz w:val="21"/>
               </w:rPr>
               <w:t>167.00</w:t>
             </w:r>
@@ -270,20 +437,21 @@
         </w:tc>
         <w:tc>
           <w:tcPr>
-            <w:tcW w:type="dxa" w:w="1728"/>
+            <w:tcW w:type="dxa" w:w="1836"/>
+            <w:vAlign w:val="center"/>
           </w:tcPr>
           <w:p>
+            <w:pPr>
+              <w:spacing w:after="0" w:line="288" w:lineRule="auto"/>
+            </w:pPr>
+            <w:r/>
             <w:r>
               <w:rPr>
                 <w:rFonts w:ascii="Times New Roman" w:hAnsi="Times New Roman" w:eastAsia="宋体"/>
+                <w:b w:val="0"/>
+                <w:sz w:val="20"/>
               </w:rPr>
-            </w:r>
-            <w:r>
-              <w:rPr>
-                <w:rFonts w:ascii="Times New Roman" w:hAnsi="Times New Roman" w:eastAsia="宋体"/>
-                <w:sz w:val="24"/>
-              </w:rPr>
-              <w:t>申报金额</w:t>
+              <w:t>淘宝桌面版商品截图价格</w:t>
             </w:r>
           </w:p>
         </w:tc>
@@ -291,13 +459,19 @@
       <w:tr>
         <w:tc>
           <w:tcPr>
-            <w:tcW w:type="dxa" w:w="1728"/>
+            <w:tcW w:type="dxa" w:w="1836"/>
+            <w:vAlign w:val="center"/>
           </w:tcPr>
           <w:p>
+            <w:pPr>
+              <w:spacing w:after="0" w:line="288" w:lineRule="auto"/>
+            </w:pPr>
+            <w:r/>
             <w:r>
               <w:rPr>
                 <w:rFonts w:ascii="Times New Roman" w:hAnsi="Times New Roman" w:eastAsia="宋体"/>
-                <w:sz w:val="16"/>
+                <w:b w:val="0"/>
+                <w:sz w:val="21"/>
               </w:rPr>
               <w:t>合计</w:t>
             </w:r>
@@ -305,48 +479,60 @@
         </w:tc>
         <w:tc>
           <w:tcPr>
-            <w:tcW w:type="dxa" w:w="1728"/>
+            <w:tcW w:type="dxa" w:w="1836"/>
+            <w:vAlign w:val="center"/>
           </w:tcPr>
           <w:p>
             <w:pPr>
+              <w:spacing w:after="0" w:line="288" w:lineRule="auto"/>
               <w:jc w:val="center"/>
             </w:pPr>
+            <w:r/>
             <w:r>
               <w:rPr>
                 <w:rFonts w:ascii="Times New Roman" w:hAnsi="Times New Roman" w:eastAsia="宋体"/>
-                <w:sz w:val="16"/>
+                <w:b w:val="0"/>
+                <w:sz w:val="21"/>
               </w:rPr>
             </w:r>
           </w:p>
         </w:tc>
         <w:tc>
           <w:tcPr>
-            <w:tcW w:type="dxa" w:w="1728"/>
+            <w:tcW w:type="dxa" w:w="1836"/>
+            <w:vAlign w:val="center"/>
           </w:tcPr>
           <w:p>
             <w:pPr>
+              <w:spacing w:after="0" w:line="288" w:lineRule="auto"/>
               <w:jc w:val="center"/>
             </w:pPr>
+            <w:r/>
             <w:r>
               <w:rPr>
                 <w:rFonts w:ascii="Times New Roman" w:hAnsi="Times New Roman" w:eastAsia="宋体"/>
-                <w:sz w:val="16"/>
+                <w:b w:val="0"/>
+                <w:sz w:val="21"/>
               </w:rPr>
             </w:r>
           </w:p>
         </w:tc>
         <w:tc>
           <w:tcPr>
-            <w:tcW w:type="dxa" w:w="1728"/>
+            <w:tcW w:type="dxa" w:w="1836"/>
+            <w:vAlign w:val="center"/>
           </w:tcPr>
           <w:p>
             <w:pPr>
+              <w:spacing w:after="0" w:line="288" w:lineRule="auto"/>
               <w:jc w:val="center"/>
             </w:pPr>
+            <w:r/>
             <w:r>
               <w:rPr>
                 <w:rFonts w:ascii="Times New Roman" w:hAnsi="Times New Roman" w:eastAsia="宋体"/>
-                <w:sz w:val="16"/>
+                <w:b w:val="0"/>
+                <w:sz w:val="21"/>
               </w:rPr>
               <w:t>167.00</w:t>
             </w:r>
@@ -354,32 +540,50 @@
         </w:tc>
         <w:tc>
           <w:tcPr>
-            <w:tcW w:type="dxa" w:w="1728"/>
+            <w:tcW w:type="dxa" w:w="1836"/>
+            <w:vAlign w:val="center"/>
           </w:tcPr>
           <w:p>
+            <w:pPr>
+              <w:spacing w:after="0" w:line="288" w:lineRule="auto"/>
+            </w:pPr>
+            <w:r/>
             <w:r>
               <w:rPr>
                 <w:rFonts w:ascii="Times New Roman" w:hAnsi="Times New Roman" w:eastAsia="宋体"/>
+                <w:b w:val="0"/>
+                <w:sz w:val="20"/>
               </w:rPr>
-            </w:r>
-            <w:r>
-              <w:rPr>
-                <w:rFonts w:ascii="Times New Roman" w:hAnsi="Times New Roman" w:eastAsia="宋体"/>
-                <w:sz w:val="24"/>
-              </w:rPr>
-              <w:t>预算合计</w:t>
+              <w:t>商品截图记录价</w:t>
             </w:r>
           </w:p>
         </w:tc>
       </w:tr>
     </w:tbl>
+    <w:p/>
+    <w:p>
+      <w:pPr>
+        <w:spacing w:line="324" w:lineRule="auto" w:after="120"/>
+        <w:ind w:firstLine="420"/>
+      </w:pPr>
+      <w:r>
+        <w:rPr>
+          <w:rFonts w:ascii="Times New Roman" w:hAnsi="Times New Roman" w:eastAsia="宋体"/>
+          <w:b w:val="0"/>
+          <w:sz w:val="24"/>
+        </w:rPr>
+        <w:t>本次经费用于购置 BGA200 4 合 1 植锡台一套。该工具金额较低、可长期复用，能够补齐实验室在 BGA200 封装返修中的基础工具短板，适合作为硬件调试和维修工具纳入实验室公共工具体系。</w:t>
+      </w:r>
+    </w:p>
     <w:p>
       <w:pPr>
         <w:pStyle w:val="Heading1"/>
+        <w:spacing w:before="200" w:after="120"/>
       </w:pPr>
       <w:r>
         <w:rPr>
           <w:rFonts w:ascii="Times New Roman" w:hAnsi="Times New Roman" w:eastAsia="黑体"/>
+          <w:b/>
           <w:sz w:val="28"/>
         </w:rPr>
         <w:t>四、取得效果或结果</w:t>
@@ -388,85 +592,123 @@
     <w:p>
       <w:pPr>
         <w:pStyle w:val="ListBullet"/>
+        <w:spacing w:line="312" w:lineRule="auto" w:after="80"/>
       </w:pPr>
       <w:r>
         <w:rPr>
           <w:rFonts w:ascii="Times New Roman" w:hAnsi="Times New Roman" w:eastAsia="宋体"/>
+          <w:b w:val="0"/>
+          <w:sz w:val="24"/>
         </w:rPr>
-        <w:t>让实验室拥有 BGA200 内存颗粒返修能力，减少后续完全依赖外部返修或整板替换的成本。</w:t>
+        <w:t>实验室拥有一套 BGA200 内存颗粒返修工具，具备开展小型 BGA 封装植锡和返修验证的基础条件。</w:t>
       </w:r>
     </w:p>
     <w:p>
       <w:pPr>
         <w:pStyle w:val="ListBullet"/>
+        <w:spacing w:line="312" w:lineRule="auto" w:after="80"/>
       </w:pPr>
       <w:r>
         <w:rPr>
           <w:rFonts w:ascii="Times New Roman" w:hAnsi="Times New Roman" w:eastAsia="宋体"/>
+          <w:b w:val="0"/>
+          <w:sz w:val="24"/>
         </w:rPr>
-        <w:t>沉淀拆焊、清焊盘、植锡、回流和检查流程记录，支撑实验室硬件维护和板级升级能力建设。</w:t>
+        <w:t>形成一份 BGA200 返修流程记录，包括拆焊准备、清焊盘、定位、植锡、回流和焊后检查步骤。</w:t>
       </w:r>
     </w:p>
     <w:p>
       <w:pPr>
         <w:pStyle w:val="ListBullet"/>
+        <w:spacing w:line="312" w:lineRule="auto" w:after="80"/>
       </w:pPr>
       <w:r>
         <w:rPr>
           <w:rFonts w:ascii="Times New Roman" w:hAnsi="Times New Roman" w:eastAsia="宋体"/>
+          <w:b w:val="0"/>
+          <w:sz w:val="24"/>
         </w:rPr>
-        <w:t>为 Radxa Cubie A5E 由 1G 升级到 4G 以及后续开发板、FPGA 板卡内存颗粒替换提供工具基础。</w:t>
+        <w:t>提升实验室对 FPGA、Linux 开发板和边缘计算板硬件故障的定位与处理能力。</w:t>
+      </w:r>
+    </w:p>
+    <w:p>
+      <w:pPr>
+        <w:pStyle w:val="ListBullet"/>
+        <w:spacing w:line="312" w:lineRule="auto" w:after="80"/>
+      </w:pPr>
+      <w:r>
+        <w:rPr>
+          <w:rFonts w:ascii="Times New Roman" w:hAnsi="Times New Roman" w:eastAsia="宋体"/>
+          <w:b w:val="0"/>
+          <w:sz w:val="24"/>
+        </w:rPr>
+        <w:t>降低简单返修场景对外部维修和整板替换的依赖，缩短样机联调中的硬件处理周期。</w:t>
+      </w:r>
+    </w:p>
+    <w:p>
+      <w:pPr>
+        <w:pStyle w:val="ListBullet"/>
+        <w:spacing w:line="312" w:lineRule="auto" w:after="80"/>
+      </w:pPr>
+      <w:r>
+        <w:rPr>
+          <w:rFonts w:ascii="Times New Roman" w:hAnsi="Times New Roman" w:eastAsia="宋体"/>
+          <w:b w:val="0"/>
+          <w:sz w:val="24"/>
+        </w:rPr>
+        <w:t>为后续硬件维修 SOP、板卡可靠性改进和实验室工具能力建设提供基础支撑。</w:t>
       </w:r>
     </w:p>
     <w:p>
       <w:pPr>
         <w:pStyle w:val="Heading1"/>
+        <w:spacing w:before="200" w:after="120"/>
       </w:pPr>
       <w:r>
         <w:rPr>
           <w:rFonts w:ascii="Times New Roman" w:hAnsi="Times New Roman" w:eastAsia="黑体"/>
+          <w:b/>
           <w:sz w:val="28"/>
         </w:rPr>
         <w:t>五、其他</w:t>
       </w:r>
     </w:p>
     <w:p>
-      <w:r>
-        <w:rPr>
-          <w:rFonts w:ascii="Times New Roman" w:hAnsi="Times New Roman" w:eastAsia="宋体"/>
-        </w:rPr>
-      </w:r>
-      <w:r>
-        <w:rPr>
-          <w:rFonts w:ascii="Times New Roman" w:hAnsi="Times New Roman" w:eastAsia="宋体"/>
-          <w:sz w:val="24"/>
-        </w:rPr>
-        <w:t>本项目采购对象明确，预算用于购置申报表中列明的工具与耗材，采购后按实验室设备耗材管理要求入库和使用。</w:t>
-      </w:r>
-    </w:p>
-    <w:p>
-      <w:r>
-        <w:rPr>
-          <w:rFonts w:ascii="Times New Roman" w:hAnsi="Times New Roman" w:eastAsia="宋体"/>
-          <w:b/>
-        </w:rPr>
-        <w:t>图片凭证：</w:t>
-      </w:r>
-    </w:p>
-    <w:p>
+      <w:pPr>
+        <w:spacing w:line="324" w:lineRule="auto" w:after="120"/>
+        <w:ind w:firstLine="420"/>
+      </w:pPr>
       <w:r>
         <w:rPr>
           <w:rFonts w:ascii="Times New Roman" w:hAnsi="Times New Roman" w:eastAsia="宋体"/>
           <w:b w:val="0"/>
+          <w:sz w:val="24"/>
         </w:rPr>
-        <w:t>BGA200 植锡台价格截图</w:t>
+        <w:t>本项目采购对象明确为 BGA200 4 合 1 植锡台。商品截图用于说明采购工具形态、规格和预算金额；到货后可按实验室工具管理要求记录规格、数量、外观和附件完整性。</w:t>
       </w:r>
     </w:p>
     <w:p>
+      <w:pPr>
+        <w:spacing w:line="324" w:lineRule="auto" w:after="120"/>
+        <w:jc w:val="center"/>
+      </w:pPr>
+      <w:r>
+        <w:rPr>
+          <w:rFonts w:ascii="Times New Roman" w:hAnsi="Times New Roman" w:eastAsia="宋体"/>
+          <w:b w:val="0"/>
+          <w:sz w:val="21"/>
+        </w:rPr>
+        <w:t>图 1  BGA200 4 合 1 植锡台商品截图</w:t>
+      </w:r>
+    </w:p>
+    <w:p>
+      <w:pPr>
+        <w:jc w:val="center"/>
+      </w:pPr>
       <w:r>
         <w:drawing>
           <wp:inline xmlns:a="http://schemas.openxmlformats.org/drawingml/2006/main" xmlns:pic="http://schemas.openxmlformats.org/drawingml/2006/picture">
-            <wp:extent cx="5212080" cy="2834068"/>
+            <wp:extent cx="4860000" cy="2642625"/>
             <wp:docPr id="1" name="Picture 1"/>
             <wp:cNvGraphicFramePr>
               <a:graphicFrameLocks noChangeAspect="1"/>
@@ -487,7 +729,7 @@
                   <pic:spPr>
                     <a:xfrm>
                       <a:off x="0" y="0"/>
-                      <a:ext cx="5212080" cy="2834068"/>
+                      <a:ext cx="4860000" cy="2642625"/>
                     </a:xfrm>
                     <a:prstGeom prst="rect"/>
                   </pic:spPr>
@@ -500,7 +742,7 @@
     </w:p>
     <w:sectPr>
       <w:pgSz w:w="12240" w:h="15840"/>
-      <w:pgMar w:top="1440" w:right="1800" w:bottom="1440" w:left="1800" w:header="720" w:footer="720" w:gutter="0"/>
+      <w:pgMar w:top="1361" w:right="1531" w:bottom="1361" w:left="1531" w:header="720" w:footer="720" w:gutter="0"/>
       <w:cols w:space="720"/>
       <w:docGrid w:linePitch="360"/>
     </w:sectPr>
@@ -873,7 +1115,7 @@
     <w:rsid w:val="00FC693F"/>
     <w:rPr>
       <w:rFonts w:ascii="Times New Roman" w:hAnsi="Times New Roman" w:eastAsia="宋体"/>
-      <w:sz w:val="21"/>
+      <w:sz w:val="24"/>
     </w:rPr>
   </w:style>
   <w:style w:type="paragraph" w:styleId="Header">
@@ -959,7 +1201,7 @@
       <w:outlineLvl w:val="1"/>
     </w:pPr>
     <w:rPr>
-      <w:rFonts w:asciiTheme="majorHAnsi" w:eastAsiaTheme="majorEastAsia" w:hAnsiTheme="majorHAnsi" w:cstheme="majorBidi" w:ascii="Times New Roman" w:hAnsi="Times New Roman" w:eastAsia="黑体"/>
+      <w:rFonts w:asciiTheme="majorHAnsi" w:eastAsiaTheme="majorEastAsia" w:hAnsiTheme="majorHAnsi" w:cstheme="majorBidi"/>
       <w:b/>
       <w:bCs/>
       <w:color w:val="4F81BD" w:themeColor="accent1"/>
@@ -983,7 +1225,7 @@
       <w:outlineLvl w:val="2"/>
     </w:pPr>
     <w:rPr>
-      <w:rFonts w:asciiTheme="majorHAnsi" w:eastAsiaTheme="majorEastAsia" w:hAnsiTheme="majorHAnsi" w:cstheme="majorBidi" w:ascii="Times New Roman" w:hAnsi="Times New Roman" w:eastAsia="黑体"/>
+      <w:rFonts w:asciiTheme="majorHAnsi" w:eastAsiaTheme="majorEastAsia" w:hAnsiTheme="majorHAnsi" w:cstheme="majorBidi"/>
       <w:b/>
       <w:bCs/>
       <w:color w:val="4F81BD" w:themeColor="accent1"/>
@@ -1307,10 +1549,6 @@
     <w:pPr>
       <w:spacing w:after="120"/>
     </w:pPr>
-    <w:rPr>
-      <w:rFonts w:ascii="Times New Roman" w:hAnsi="Times New Roman" w:eastAsia="宋体"/>
-      <w:sz w:val="21"/>
-    </w:rPr>
   </w:style>
   <w:style w:type="character" w:customStyle="1" w:styleId="BodyTextChar">
     <w:name w:val="Body Text Char"/>

</xml_diff>

<commit_message>
Generate proposal documents from markdown
</commit_message>
<xml_diff>
--- a/applications/2026/Q2/BGA200内存返修工具/BGA200内存返修工具-申报书.docx
+++ b/applications/2026/Q2/BGA200内存返修工具/BGA200内存返修工具-申报书.docx
@@ -18,13 +18,14 @@
     </w:p>
     <w:p>
       <w:pPr>
-        <w:jc w:val="center"/>
+        <w:spacing w:line="324" w:lineRule="auto" w:after="120"/>
+        <w:ind w:firstLine="420"/>
       </w:pPr>
       <w:r>
         <w:rPr>
           <w:rFonts w:ascii="Times New Roman" w:hAnsi="Times New Roman" w:eastAsia="宋体"/>
           <w:b w:val="0"/>
-          <w:sz w:val="22"/>
+          <w:sz w:val="24"/>
         </w:rPr>
         <w:t>申报日期：2026-05-25    申报状态：待提交</w:t>
       </w:r>
@@ -248,7 +249,7 @@
           </w:tcPr>
           <w:p>
             <w:pPr>
-              <w:spacing w:after="0" w:line="288" w:lineRule="auto"/>
+              <w:spacing w:line="288" w:lineRule="auto" w:after="0"/>
               <w:jc w:val="center"/>
             </w:pPr>
             <w:r/>
@@ -270,7 +271,7 @@
           </w:tcPr>
           <w:p>
             <w:pPr>
-              <w:spacing w:after="0" w:line="288" w:lineRule="auto"/>
+              <w:spacing w:line="288" w:lineRule="auto" w:after="0"/>
               <w:jc w:val="center"/>
             </w:pPr>
             <w:r/>
@@ -292,7 +293,7 @@
           </w:tcPr>
           <w:p>
             <w:pPr>
-              <w:spacing w:after="0" w:line="288" w:lineRule="auto"/>
+              <w:spacing w:line="288" w:lineRule="auto" w:after="0"/>
               <w:jc w:val="center"/>
             </w:pPr>
             <w:r/>
@@ -314,7 +315,7 @@
           </w:tcPr>
           <w:p>
             <w:pPr>
-              <w:spacing w:after="0" w:line="288" w:lineRule="auto"/>
+              <w:spacing w:line="288" w:lineRule="auto" w:after="0"/>
               <w:jc w:val="center"/>
             </w:pPr>
             <w:r/>
@@ -336,7 +337,7 @@
           </w:tcPr>
           <w:p>
             <w:pPr>
-              <w:spacing w:after="0" w:line="288" w:lineRule="auto"/>
+              <w:spacing w:line="288" w:lineRule="auto" w:after="0"/>
               <w:jc w:val="center"/>
             </w:pPr>
             <w:r/>
@@ -359,7 +360,7 @@
           </w:tcPr>
           <w:p>
             <w:pPr>
-              <w:spacing w:after="0" w:line="288" w:lineRule="auto"/>
+              <w:spacing w:line="288" w:lineRule="auto" w:after="0"/>
             </w:pPr>
             <w:r/>
             <w:r>
@@ -379,7 +380,7 @@
           </w:tcPr>
           <w:p>
             <w:pPr>
-              <w:spacing w:after="0" w:line="288" w:lineRule="auto"/>
+              <w:spacing w:line="288" w:lineRule="auto" w:after="0"/>
               <w:jc w:val="center"/>
             </w:pPr>
             <w:r/>
@@ -400,7 +401,7 @@
           </w:tcPr>
           <w:p>
             <w:pPr>
-              <w:spacing w:after="0" w:line="288" w:lineRule="auto"/>
+              <w:spacing w:line="288" w:lineRule="auto" w:after="0"/>
               <w:jc w:val="center"/>
             </w:pPr>
             <w:r/>
@@ -421,7 +422,7 @@
           </w:tcPr>
           <w:p>
             <w:pPr>
-              <w:spacing w:after="0" w:line="288" w:lineRule="auto"/>
+              <w:spacing w:line="288" w:lineRule="auto" w:after="0"/>
               <w:jc w:val="center"/>
             </w:pPr>
             <w:r/>
@@ -442,7 +443,7 @@
           </w:tcPr>
           <w:p>
             <w:pPr>
-              <w:spacing w:after="0" w:line="288" w:lineRule="auto"/>
+              <w:spacing w:line="288" w:lineRule="auto" w:after="0"/>
             </w:pPr>
             <w:r/>
             <w:r>
@@ -464,7 +465,7 @@
           </w:tcPr>
           <w:p>
             <w:pPr>
-              <w:spacing w:after="0" w:line="288" w:lineRule="auto"/>
+              <w:spacing w:line="288" w:lineRule="auto" w:after="0"/>
             </w:pPr>
             <w:r/>
             <w:r>
@@ -484,7 +485,7 @@
           </w:tcPr>
           <w:p>
             <w:pPr>
-              <w:spacing w:after="0" w:line="288" w:lineRule="auto"/>
+              <w:spacing w:line="288" w:lineRule="auto" w:after="0"/>
               <w:jc w:val="center"/>
             </w:pPr>
             <w:r/>
@@ -504,7 +505,7 @@
           </w:tcPr>
           <w:p>
             <w:pPr>
-              <w:spacing w:after="0" w:line="288" w:lineRule="auto"/>
+              <w:spacing w:line="288" w:lineRule="auto" w:after="0"/>
               <w:jc w:val="center"/>
             </w:pPr>
             <w:r/>
@@ -524,7 +525,7 @@
           </w:tcPr>
           <w:p>
             <w:pPr>
-              <w:spacing w:after="0" w:line="288" w:lineRule="auto"/>
+              <w:spacing w:line="288" w:lineRule="auto" w:after="0"/>
               <w:jc w:val="center"/>
             </w:pPr>
             <w:r/>
@@ -545,7 +546,7 @@
           </w:tcPr>
           <w:p>
             <w:pPr>
-              <w:spacing w:after="0" w:line="288" w:lineRule="auto"/>
+              <w:spacing w:line="288" w:lineRule="auto" w:after="0"/>
             </w:pPr>
             <w:r/>
             <w:r>

</xml_diff>